<commit_message>
Name all five children in the dedication
Lydia-Elise, Anna-Claire, McKenna-Rose, Ethan-Oliver, and
Meri-Emmelyn, set across three centred lines so the five hyphenated
names balance. Applied to both the PDF and the DOCX.

Co-Authored-By: Claude Opus 5 <noreply@anthropic.com>
Claude-Session: https://claude.ai/code/session_01YNULEXoAk6kLXXsBBXFm4g
</commit_message>
<xml_diff>
--- a/manuscript-exports/American_Injustice_FULL_13pt.docx
+++ b/manuscript-exports/American_Injustice_FULL_13pt.docx
@@ -38,7 +38,7 @@
     </w:p>
     <w:p>
       <w:pPr>
-        <w:spacing w:before="4000"/>
+        <w:spacing w:before="3800"/>
         <w:ind w:firstLine="0"/>
         <w:jc w:val="center"/>
       </w:pPr>
@@ -47,7 +47,17 @@
           <w:rFonts w:ascii="Georgia" w:hAnsi="Georgia"/>
           <w:sz w:val="24"/>
         </w:rPr>
-        <w:t>For my children, and for Meri-Emmelyn,</w:t>
+        <w:t>For Lydia-Elise, Anna-Claire, McKenna-Rose,</w:t>
+      </w:r>
+      <w:r>
+        <w:br/>
+      </w:r>
+      <w:r>
+        <w:rPr>
+          <w:rFonts w:ascii="Georgia" w:hAnsi="Georgia"/>
+          <w:sz w:val="24"/>
+        </w:rPr>
+        <w:t>Ethan-Oliver, and Meri-Emmelyn —</w:t>
       </w:r>
       <w:r>
         <w:br/>

</xml_diff>

<commit_message>
Add the cover as a full-bleed first page in both exports
The artwork is 1024x1535, which is exactly 2:3 and so matches the 6x9
trim with nothing cropped and no letterboxing. It runs edge to edge:
the cover page carries zero margins, no folio and no running head, and
sits ahead of the typographic title page.

Source art committed at art/cover.png. The PDF builder picks up any
cover.* placed in art/, manuscript-exports/, or the repo root, so
replacing the file is enough to rebuild.

The DOCX gets the same treatment via its own zero-margin first
section, with the body restored to 6x9 and normal margins after the
section break.

Note for a print edition: at 6x9 the art resolves to about 171 DPI.
That is fine for screen and ebook distribution but under the 300 DPI
most print vendors require, which would want roughly 1800x2700.

Co-Authored-By: Claude Opus 5 <noreply@anthropic.com>
Claude-Session: https://claude.ai/code/session_01YNULEXoAk6kLXXsBBXFm4g
</commit_message>
<xml_diff>
--- a/manuscript-exports/American_Injustice_FULL_13pt.docx
+++ b/manuscript-exports/American_Injustice_FULL_13pt.docx
@@ -2,6 +2,57 @@
 <file path=word/document.xml><?xml version="1.0" encoding="utf-8"?>
 <w:document xmlns:wpc="http://schemas.microsoft.com/office/word/2010/wordprocessingCanvas" xmlns:mo="http://schemas.microsoft.com/office/mac/office/2008/main" xmlns:mc="http://schemas.openxmlformats.org/markup-compatibility/2006" xmlns:mv="urn:schemas-microsoft-com:mac:vml" xmlns:o="urn:schemas-microsoft-com:office:office" xmlns:r="http://schemas.openxmlformats.org/officeDocument/2006/relationships" xmlns:m="http://schemas.openxmlformats.org/officeDocument/2006/math" xmlns:v="urn:schemas-microsoft-com:vml" xmlns:wp14="http://schemas.microsoft.com/office/word/2010/wordprocessingDrawing" xmlns:wp="http://schemas.openxmlformats.org/drawingml/2006/wordprocessingDrawing" xmlns:w10="urn:schemas-microsoft-com:office:word" xmlns:w="http://schemas.openxmlformats.org/wordprocessingml/2006/main" xmlns:w14="http://schemas.microsoft.com/office/word/2010/wordml" xmlns:wpg="http://schemas.microsoft.com/office/word/2010/wordprocessingGroup" xmlns:wpi="http://schemas.microsoft.com/office/word/2010/wordprocessingInk" xmlns:wne="http://schemas.microsoft.com/office/word/2006/wordml" xmlns:wps="http://schemas.microsoft.com/office/word/2010/wordprocessingShape" mc:Ignorable="w14 wp14">
   <w:body>
+    <w:p>
+      <w:pPr>
+        <w:spacing w:before="0" w:after="0"/>
+        <w:ind w:firstLine="0"/>
+        <w:jc w:val="center"/>
+      </w:pPr>
+      <w:r>
+        <w:drawing>
+          <wp:inline xmlns:a="http://schemas.openxmlformats.org/drawingml/2006/main" xmlns:pic="http://schemas.openxmlformats.org/drawingml/2006/picture">
+            <wp:extent cx="5486400" cy="8229600"/>
+            <wp:docPr id="1" name="Picture 1"/>
+            <wp:cNvGraphicFramePr>
+              <a:graphicFrameLocks noChangeAspect="1"/>
+            </wp:cNvGraphicFramePr>
+            <a:graphic>
+              <a:graphicData uri="http://schemas.openxmlformats.org/drawingml/2006/picture">
+                <pic:pic>
+                  <pic:nvPicPr>
+                    <pic:cNvPr id="0" name="cover.png"/>
+                    <pic:cNvPicPr/>
+                  </pic:nvPicPr>
+                  <pic:blipFill>
+                    <a:blip r:embed="rId9"/>
+                    <a:stretch>
+                      <a:fillRect/>
+                    </a:stretch>
+                  </pic:blipFill>
+                  <pic:spPr>
+                    <a:xfrm>
+                      <a:off x="0" y="0"/>
+                      <a:ext cx="5486400" cy="8229600"/>
+                    </a:xfrm>
+                    <a:prstGeom prst="rect"/>
+                  </pic:spPr>
+                </pic:pic>
+              </a:graphicData>
+            </a:graphic>
+          </wp:inline>
+        </w:drawing>
+      </w:r>
+    </w:p>
+    <w:p>
+      <w:pPr>
+        <w:sectPr>
+          <w:pgSz w:w="8640" w:h="12960"/>
+          <w:pgMar w:top="0" w:right="0" w:bottom="0" w:left="0" w:header="720" w:footer="720" w:gutter="0"/>
+          <w:cols w:space="720"/>
+          <w:docGrid w:linePitch="360"/>
+        </w:sectPr>
+      </w:pPr>
+    </w:p>
     <w:p>
       <w:pPr>
         <w:spacing w:before="3000"/>

</xml_diff>